<commit_message>
updates base resume structure
</commit_message>
<xml_diff>
--- a/resume/generated/Xevier_T_CV_en.generated.docx
+++ b/resume/generated/Xevier_T_CV_en.generated.docx
@@ -1,6 +1,6 @@
 
 <file path=word/document.xml><?xml version="1.0" encoding="utf-8"?>
-<w:document xmlns:wpc="http://schemas.microsoft.com/office/word/2010/wordprocessingCanvas" xmlns:cx="http://schemas.microsoft.com/office/drawing/2014/chartex" xmlns:cx1="http://schemas.microsoft.com/office/drawing/2015/9/8/chartex" xmlns:cx2="http://schemas.microsoft.com/office/drawing/2015/10/21/chartex" xmlns:cx3="http://schemas.microsoft.com/office/drawing/2016/5/9/chartex" xmlns:cx4="http://schemas.microsoft.com/office/drawing/2016/5/10/chartex" xmlns:cx5="http://schemas.microsoft.com/office/drawing/2016/5/11/chartex" xmlns:cx6="http://schemas.microsoft.com/office/drawing/2016/5/12/chartex" xmlns:cx7="http://schemas.microsoft.com/office/drawing/2016/5/13/chartex" xmlns:cx8="http://schemas.microsoft.com/office/drawing/2016/5/14/chartex" xmlns:mc="http://schemas.openxmlformats.org/markup-compatibility/2006" xmlns:aink="http://schemas.microsoft.com/office/drawing/2016/ink" xmlns:am3d="http://schemas.microsoft.com/office/drawing/2017/model3d" xmlns:o="urn:schemas-microsoft-com:office:office" xmlns:oel="http://schemas.microsoft.com/office/2019/extlst" xmlns:r="http://schemas.openxmlformats.org/officeDocument/2006/relationships" xmlns:m="http://schemas.openxmlformats.org/officeDocument/2006/math" xmlns:v="urn:schemas-microsoft-com:vml" xmlns:wp14="http://schemas.microsoft.com/office/word/2010/wordprocessingDrawing" xmlns:wp="http://schemas.openxmlformats.org/drawingml/2006/wordprocessingDrawing" xmlns:w10="urn:schemas-microsoft-com:office:word" xmlns:w="http://schemas.openxmlformats.org/wordprocessingml/2006/main" xmlns:w14="http://schemas.microsoft.com/office/word/2010/wordml" xmlns:w15="http://schemas.microsoft.com/office/word/2012/wordml" xmlns:w16cei="http://schemas.microsoft.com/office/word/2026/wordml/cei" xmlns:w16cex="http://schemas.microsoft.com/office/word/2018/wordml/cex" xmlns:w16cid="http://schemas.microsoft.com/office/word/2016/wordml/cid" xmlns:w16="http://schemas.microsoft.com/office/word/2018/wordml" xmlns:w16du="http://schemas.microsoft.com/office/word/2023/wordml/word16du" xmlns:w16sdtdh="http://schemas.microsoft.com/office/word/2020/wordml/sdtdatahash" xmlns:w16sdtfl="http://schemas.microsoft.com/office/word/2024/wordml/sdtformatlock" xmlns:w16se="http://schemas.microsoft.com/office/word/2015/wordml/symex" xmlns:wpg="http://schemas.microsoft.com/office/word/2010/wordprocessingGroup" xmlns:wpi="http://schemas.microsoft.com/office/word/2010/wordprocessingInk" xmlns:wne="http://schemas.microsoft.com/office/word/2006/wordml" xmlns:wps="http://schemas.microsoft.com/office/word/2010/wordprocessingShape" mc:Ignorable="w14 w15 w16se w16cid w16 w16cex w16sdtdh w16sdtfl w16du wp14">
+<w:document xmlns:wpc="http://schemas.microsoft.com/office/word/2010/wordprocessingCanvas" xmlns:cx="http://schemas.microsoft.com/office/drawing/2014/chartex" xmlns:cx1="http://schemas.microsoft.com/office/drawing/2015/9/8/chartex" xmlns:cx2="http://schemas.microsoft.com/office/drawing/2015/10/21/chartex" xmlns:cx3="http://schemas.microsoft.com/office/drawing/2016/5/9/chartex" xmlns:cx4="http://schemas.microsoft.com/office/drawing/2016/5/10/chartex" xmlns:cx5="http://schemas.microsoft.com/office/drawing/2016/5/11/chartex" xmlns:cx6="http://schemas.microsoft.com/office/drawing/2016/5/12/chartex" xmlns:cx7="http://schemas.microsoft.com/office/drawing/2016/5/13/chartex" xmlns:cx8="http://schemas.microsoft.com/office/drawing/2016/5/14/chartex" xmlns:mc="http://schemas.openxmlformats.org/markup-compatibility/2006" xmlns:aink="http://schemas.microsoft.com/office/drawing/2016/ink" xmlns:am3d="http://schemas.microsoft.com/office/drawing/2017/model3d" xmlns:o="urn:schemas-microsoft-com:office:office" xmlns:oel="http://schemas.microsoft.com/office/2019/extlst" xmlns:r="http://schemas.openxmlformats.org/officeDocument/2006/relationships" xmlns:m="http://schemas.openxmlformats.org/officeDocument/2006/math" xmlns:v="urn:schemas-microsoft-com:vml" xmlns:wp14="http://schemas.microsoft.com/office/word/2010/wordprocessingDrawing" xmlns:wp="http://schemas.openxmlformats.org/drawingml/2006/wordprocessingDrawing" xmlns:w10="urn:schemas-microsoft-com:office:word" xmlns:w="http://schemas.openxmlformats.org/wordprocessingml/2006/main" xmlns:w14="http://schemas.microsoft.com/office/word/2010/wordml" xmlns:w15="http://schemas.microsoft.com/office/word/2012/wordml" xmlns:w16cex="http://schemas.microsoft.com/office/word/2018/wordml/cex" xmlns:w16cid="http://schemas.microsoft.com/office/word/2016/wordml/cid" xmlns:w16="http://schemas.microsoft.com/office/word/2018/wordml" xmlns:w16du="http://schemas.microsoft.com/office/word/2023/wordml/word16du" xmlns:w16sdtdh="http://schemas.microsoft.com/office/word/2020/wordml/sdtdatahash" xmlns:w16sdtfl="http://schemas.microsoft.com/office/word/2024/wordml/sdtformatlock" xmlns:w16se="http://schemas.microsoft.com/office/word/2015/wordml/symex" xmlns:wpg="http://schemas.microsoft.com/office/word/2010/wordprocessingGroup" xmlns:wpi="http://schemas.microsoft.com/office/word/2010/wordprocessingInk" xmlns:wne="http://schemas.microsoft.com/office/word/2006/wordml" xmlns:wps="http://schemas.microsoft.com/office/word/2010/wordprocessingShape" mc:Ignorable="w14 w15 w16se w16cid w16 w16cex w16sdtdh w16sdtfl w16du wp14">
   <w:body>
     <w:p>
       <w:pPr>
@@ -31,11 +31,6 @@
         </w:tabs>
         <w:spacing w:after="200" w:line="240" w:lineRule="auto"/>
         <w:jc w:val="center"/>
-        <w:rPr>
-          <w:rFonts w:ascii="Roboto Light" w:eastAsia="Roboto Light" w:hAnsi="Roboto Light" w:cs="Roboto Light"/>
-          <w:sz w:val="20"/>
-          <w:szCs w:val="20"/>
-        </w:rPr>
       </w:pPr>
       <w:hyperlink r:id="rId6" w:history="1">
         <w:r>
@@ -53,6 +48,7 @@
         <w:t xml:space="preserve"> • </w:t>
       </w:r>
       <w:hyperlink r:id="rId7" w:history="1">
+        <w:proofErr w:type="spellStart"/>
         <w:r>
           <w:rPr>
             <w:rStyle w:val="Hyperlink"/>
@@ -60,6 +56,7 @@
           </w:rPr>
           <w:t>xevier.dev</w:t>
         </w:r>
+        <w:proofErr w:type="spellEnd"/>
       </w:hyperlink>
       <w:r>
         <w:rPr>
@@ -67,15 +64,52 @@
         </w:rPr>
         <w:t xml:space="preserve"> • </w:t>
       </w:r>
-      <w:hyperlink r:id="rId8">
+      <w:hyperlink r:id="rId8" w:history="1">
         <w:r>
           <w:rPr>
+            <w:rStyle w:val="Hyperlink"/>
             <w:rFonts w:ascii="Roboto Light" w:hAnsi="Roboto Light"/>
           </w:rPr>
-          <w:t>linkedin.com/in/xevierturrubiartes</w:t>
+          <w:t>linkedin.com/in/</w:t>
         </w:r>
+        <w:proofErr w:type="spellStart"/>
+        <w:r>
+          <w:rPr>
+            <w:rStyle w:val="Hyperlink"/>
+            <w:rFonts w:ascii="Roboto Light" w:hAnsi="Roboto Light"/>
+          </w:rPr>
+          <w:t>xevierturrubiartes</w:t>
+        </w:r>
+        <w:proofErr w:type="spellEnd"/>
       </w:hyperlink>
     </w:p>
+    <w:sdt>
+      <w:sdtPr>
+        <w:tag w:val="summary"/>
+        <w:alias w:val="summary"/>
+        <w:text/>
+      </w:sdtPr>
+      <w:sdtContent>
+        <w:p>
+          <w:pPr>
+            <w:tabs>
+              <w:tab w:val="center" w:pos="5400"/>
+              <w:tab w:val="right" w:pos="10710"/>
+            </w:tabs>
+            <w:spacing w:before="240" w:after="240" w:line="240" w:lineRule="auto"/>
+            <w:rPr>
+              <w:rFonts w:ascii="Roboto Light" w:eastAsia="Roboto Light" w:hAnsi="Roboto Light" w:cs="Roboto Light"/>
+            </w:rPr>
+          </w:pPr>
+          <w:r>
+            <w:rPr>
+              <w:rFonts w:ascii="Roboto Light" w:eastAsia="Roboto Light" w:hAnsi="Roboto Light" w:cs="Roboto Light"/>
+            </w:rPr>
+            <w:t>Senior Full-Stack and AI Developer with 6 years of experience building SaaS products and AI platforms using TypeScript, React, Node.js, PostgreSQL, and modern LLM technologies. Experienced in software architecture, RAG and multi-agent systems, and leading small engineering teams from design through production.</w:t>
+          </w:r>
+        </w:p>
+      </w:sdtContent>
+    </w:sdt>
     <w:p>
       <w:pPr>
         <w:spacing w:before="200" w:after="0" w:line="240" w:lineRule="auto"/>
@@ -136,7 +170,7 @@
               </wp:anchor>
             </w:drawing>
           </mc:Choice>
-          <mc:Fallback>
+          <mc:Fallback xmlns:w16cei="http://schemas.microsoft.com/office/word/2026/wordml/cei">
             <w:pict>
               <v:shapetype w14:anchorId="5AB383F2" id="_x0000_t32" coordsize="21600,21600" o:spt="32" o:oned="t" path="m,l21600,21600e" filled="f">
                 <v:path arrowok="t" fillok="f" o:connecttype="none"/>
@@ -173,9 +207,8 @@
     </w:p>
     <w:sdt>
       <w:sdtPr>
+        <w:tag w:val="experience.0.company_line"/>
         <w:alias w:val="experience.0.company_line"/>
-        <w:tag w:val="experience.0.company_line"/>
-        <w:id w:val="-110745662"/>
         <w:text/>
       </w:sdtPr>
       <w:sdtContent>
@@ -206,13 +239,8 @@
     </w:sdt>
     <w:sdt>
       <w:sdtPr>
-        <w:rPr>
-          <w:i/>
-          <w:iCs/>
-        </w:rPr>
+        <w:tag w:val="experience.0.title_line"/>
         <w:alias w:val="experience.0.title_line"/>
-        <w:tag w:val="experience.0.title_line"/>
-        <w:id w:val="-1715334712"/>
         <w:text/>
       </w:sdtPr>
       <w:sdtContent>
@@ -228,8 +256,6 @@
               <w:bCs/>
               <w:i/>
               <w:iCs/>
-              <w:sz w:val="20"/>
-              <w:szCs w:val="20"/>
             </w:rPr>
           </w:pPr>
           <w:r>
@@ -239,8 +265,6 @@
               <w:bCs/>
               <w:i/>
               <w:iCs/>
-              <w:sz w:val="20"/>
-              <w:szCs w:val="20"/>
             </w:rPr>
             <w:t>AI Project Lead</w:t>
           </w:r>
@@ -253,8 +277,6 @@
               <w:bCs/>
               <w:i/>
               <w:iCs/>
-              <w:sz w:val="20"/>
-              <w:szCs w:val="20"/>
             </w:rPr>
             <w:t>January 2026 - Present</w:t>
           </w:r>
@@ -263,9 +285,8 @@
     </w:sdt>
     <w:sdt>
       <w:sdtPr>
+        <w:tag w:val="experience.0.bullets.0"/>
         <w:alias w:val="experience.0.bullets.0"/>
-        <w:tag w:val="experience.0.bullets.0"/>
-        <w:id w:val="-2112735294"/>
         <w:text/>
       </w:sdtPr>
       <w:sdtContent>
@@ -297,9 +318,8 @@
     </w:sdt>
     <w:sdt>
       <w:sdtPr>
+        <w:tag w:val="experience.0.bullets.1"/>
         <w:alias w:val="experience.0.bullets.1"/>
-        <w:tag w:val="experience.0.bullets.1"/>
-        <w:id w:val="1914738654"/>
         <w:text/>
       </w:sdtPr>
       <w:sdtContent>
@@ -331,9 +351,8 @@
     </w:sdt>
     <w:sdt>
       <w:sdtPr>
+        <w:tag w:val="experience.0.bullets.2"/>
         <w:alias w:val="experience.0.bullets.2"/>
-        <w:tag w:val="experience.0.bullets.2"/>
-        <w:id w:val="-2032868496"/>
         <w:text/>
       </w:sdtPr>
       <w:sdtContent>
@@ -365,9 +384,8 @@
     </w:sdt>
     <w:sdt>
       <w:sdtPr>
+        <w:tag w:val="experience.0.bullets.3"/>
         <w:alias w:val="experience.0.bullets.3"/>
-        <w:tag w:val="experience.0.bullets.3"/>
-        <w:id w:val="-1226916681"/>
         <w:text/>
       </w:sdtPr>
       <w:sdtContent>
@@ -399,9 +417,8 @@
     </w:sdt>
     <w:sdt>
       <w:sdtPr>
+        <w:tag w:val="experience.1.company_line"/>
         <w:alias w:val="experience.1.company_line"/>
-        <w:tag w:val="experience.1.company_line"/>
-        <w:id w:val="690025539"/>
         <w:text/>
       </w:sdtPr>
       <w:sdtContent>
@@ -432,9 +449,8 @@
     </w:sdt>
     <w:sdt>
       <w:sdtPr>
+        <w:tag w:val="experience.1.title_line"/>
         <w:alias w:val="experience.1.title_line"/>
-        <w:tag w:val="experience.1.title_line"/>
-        <w:id w:val="422464947"/>
         <w:text/>
       </w:sdtPr>
       <w:sdtContent>
@@ -448,8 +464,6 @@
               <w:rFonts w:ascii="Roboto Light" w:eastAsia="Roboto Light" w:hAnsi="Roboto Light" w:cs="Roboto Light"/>
               <w:i/>
               <w:iCs/>
-              <w:sz w:val="20"/>
-              <w:szCs w:val="20"/>
             </w:rPr>
           </w:pPr>
           <w:r>
@@ -457,8 +471,6 @@
               <w:rFonts w:ascii="Roboto Light" w:eastAsia="Roboto Light" w:hAnsi="Roboto Light" w:cs="Roboto Light"/>
               <w:i/>
               <w:iCs/>
-              <w:sz w:val="20"/>
-              <w:szCs w:val="20"/>
               <w:b/>
             </w:rPr>
             <w:t>Lead Front-end Developer</w:t>
@@ -471,8 +483,6 @@
               <w:rFonts w:ascii="Roboto Light" w:eastAsia="Roboto Light" w:hAnsi="Roboto Light" w:cs="Roboto Light"/>
               <w:i/>
               <w:iCs/>
-              <w:sz w:val="20"/>
-              <w:szCs w:val="20"/>
             </w:rPr>
             <w:t>March 2025 - December 2025</w:t>
           </w:r>
@@ -481,9 +491,8 @@
     </w:sdt>
     <w:sdt>
       <w:sdtPr>
+        <w:tag w:val="experience.1.bullets.0"/>
         <w:alias w:val="experience.1.bullets.0"/>
-        <w:tag w:val="experience.1.bullets.0"/>
-        <w:id w:val="658890026"/>
         <w:text/>
       </w:sdtPr>
       <w:sdtContent>
@@ -514,9 +523,8 @@
     </w:sdt>
     <w:sdt>
       <w:sdtPr>
+        <w:tag w:val="experience.1.bullets.1"/>
         <w:alias w:val="experience.1.bullets.1"/>
-        <w:tag w:val="experience.1.bullets.1"/>
-        <w:id w:val="-225689106"/>
         <w:text/>
       </w:sdtPr>
       <w:sdtContent>
@@ -547,9 +555,8 @@
     </w:sdt>
     <w:sdt>
       <w:sdtPr>
+        <w:tag w:val="experience.2.company_line"/>
         <w:alias w:val="experience.2.company_line"/>
-        <w:tag w:val="experience.2.company_line"/>
-        <w:id w:val="-1427335843"/>
         <w:text/>
       </w:sdtPr>
       <w:sdtContent>
@@ -584,9 +591,8 @@
     </w:sdt>
     <w:sdt>
       <w:sdtPr>
+        <w:tag w:val="experience.2.title_line"/>
         <w:alias w:val="experience.2.title_line"/>
-        <w:tag w:val="experience.2.title_line"/>
-        <w:id w:val="1903561922"/>
         <w:text/>
       </w:sdtPr>
       <w:sdtContent>
@@ -600,8 +606,6 @@
               <w:rFonts w:ascii="Roboto Light" w:eastAsia="Roboto Light" w:hAnsi="Roboto Light" w:cs="Roboto Light"/>
               <w:i/>
               <w:iCs/>
-              <w:sz w:val="20"/>
-              <w:szCs w:val="20"/>
             </w:rPr>
           </w:pPr>
           <w:r>
@@ -609,8 +613,6 @@
               <w:rFonts w:ascii="Roboto Light" w:eastAsia="Roboto Light" w:hAnsi="Roboto Light" w:cs="Roboto Light"/>
               <w:i/>
               <w:iCs/>
-              <w:sz w:val="20"/>
-              <w:szCs w:val="20"/>
               <w:b/>
             </w:rPr>
             <w:t>Lead Full-Stack Developer</w:t>
@@ -623,8 +625,6 @@
               <w:rFonts w:ascii="Roboto Light" w:eastAsia="Roboto Light" w:hAnsi="Roboto Light" w:cs="Roboto Light"/>
               <w:i/>
               <w:iCs/>
-              <w:sz w:val="20"/>
-              <w:szCs w:val="20"/>
             </w:rPr>
             <w:t>August 2024 - February 2025</w:t>
           </w:r>
@@ -633,9 +633,8 @@
     </w:sdt>
     <w:sdt>
       <w:sdtPr>
+        <w:tag w:val="experience.2.bullets.0"/>
         <w:alias w:val="experience.2.bullets.0"/>
-        <w:tag w:val="experience.2.bullets.0"/>
-        <w:id w:val="-956253031"/>
         <w:text/>
       </w:sdtPr>
       <w:sdtContent>
@@ -666,9 +665,8 @@
     </w:sdt>
     <w:sdt>
       <w:sdtPr>
+        <w:tag w:val="experience.2.bullets.1"/>
         <w:alias w:val="experience.2.bullets.1"/>
-        <w:tag w:val="experience.2.bullets.1"/>
-        <w:id w:val="-1727369129"/>
         <w:text/>
       </w:sdtPr>
       <w:sdtContent>
@@ -697,97 +695,115 @@
         </w:p>
       </w:sdtContent>
     </w:sdt>
+    <w:p>
+      <w:pPr>
+        <w:tabs>
+          <w:tab w:val="right" w:pos="10800"/>
+        </w:tabs>
+        <w:spacing w:before="120" w:after="120"/>
+        <w:rPr>
+          <w:rFonts w:ascii="Roboto Light" w:eastAsia="Roboto Light" w:hAnsi="Roboto Light" w:cs="Roboto Light"/>
+          <w:b/>
+          <w:bCs/>
+          <w:sz w:val="20"/>
+          <w:szCs w:val="20"/>
+        </w:rPr>
+      </w:pPr>
+      <w:r>
+        <w:rPr>
+          <w:rFonts w:ascii="Roboto Light" w:eastAsia="Roboto Light" w:hAnsi="Roboto Light" w:cs="Roboto Light"/>
+          <w:b/>
+          <w:bCs/>
+          <w:sz w:val="20"/>
+          <w:szCs w:val="20"/>
+        </w:rPr>
+        <w:t>Earlier Software Engineering Experience</w:t>
+      </w:r>
+      <w:r>
+        <w:rPr>
+          <w:rFonts w:ascii="Roboto Light" w:eastAsia="Roboto Light" w:hAnsi="Roboto Light" w:cs="Roboto Light"/>
+          <w:b/>
+          <w:bCs/>
+          <w:sz w:val="20"/>
+          <w:szCs w:val="20"/>
+        </w:rPr>
+        <w:t xml:space="preserve"> </w:t>
+      </w:r>
+      <w:r>
+        <w:rPr>
+          <w:rFonts w:ascii="Roboto Light" w:eastAsia="Roboto Light" w:hAnsi="Roboto Light" w:cs="Roboto Light"/>
+          <w:b/>
+          <w:bCs/>
+          <w:sz w:val="20"/>
+          <w:szCs w:val="20"/>
+        </w:rPr>
+        <w:tab/>
+      </w:r>
+      <w:r>
+        <w:rPr>
+          <w:rFonts w:ascii="Roboto Light" w:eastAsia="Roboto Light" w:hAnsi="Roboto Light" w:cs="Roboto Light"/>
+          <w:i/>
+          <w:iCs/>
+          <w:sz w:val="20"/>
+          <w:szCs w:val="20"/>
+        </w:rPr>
+        <w:t>2021–2024</w:t>
+      </w:r>
+      <w:r>
+        <w:rPr>
+          <w:rFonts w:ascii="Roboto Light" w:eastAsia="Roboto Light" w:hAnsi="Roboto Light" w:cs="Roboto Light"/>
+          <w:sz w:val="20"/>
+          <w:szCs w:val="20"/>
+        </w:rPr>
+        <w:br/>
+      </w:r>
+      <w:r>
+        <w:rPr>
+          <w:rFonts w:ascii="Roboto Light" w:eastAsia="Roboto Light" w:hAnsi="Roboto Light" w:cs="Roboto Light"/>
+          <w:i/>
+          <w:iCs/>
+          <w:sz w:val="20"/>
+          <w:szCs w:val="20"/>
+        </w:rPr>
+        <w:t xml:space="preserve">Artificial Compute · Rodeo Logistics · </w:t>
+      </w:r>
+      <w:proofErr w:type="spellStart"/>
+      <w:r>
+        <w:rPr>
+          <w:rFonts w:ascii="Roboto Light" w:eastAsia="Roboto Light" w:hAnsi="Roboto Light" w:cs="Roboto Light"/>
+          <w:i/>
+          <w:iCs/>
+          <w:sz w:val="20"/>
+          <w:szCs w:val="20"/>
+        </w:rPr>
+        <w:t>DevWorks</w:t>
+      </w:r>
+      <w:proofErr w:type="spellEnd"/>
+      <w:r>
+        <w:rPr>
+          <w:rFonts w:ascii="Roboto Light" w:eastAsia="Roboto Light" w:hAnsi="Roboto Light" w:cs="Roboto Light"/>
+          <w:sz w:val="20"/>
+          <w:szCs w:val="20"/>
+        </w:rPr>
+        <w:br/>
+      </w:r>
+      <w:r>
+        <w:rPr>
+          <w:rFonts w:ascii="Roboto Light" w:eastAsia="Roboto Light" w:hAnsi="Roboto Light" w:cs="Roboto Light"/>
+          <w:b/>
+          <w:bCs/>
+          <w:i/>
+          <w:iCs/>
+          <w:sz w:val="20"/>
+          <w:szCs w:val="20"/>
+        </w:rPr>
+        <w:t>Front-End Developer · Full-Stack Developer · Full-Stack Developer / Project Lead</w:t>
+      </w:r>
+    </w:p>
     <w:sdt>
       <w:sdtPr>
-        <w:alias w:val="experience.3.company_line"/>
-        <w:tag w:val="experience.3.company_line"/>
-        <w:id w:val="319625368"/>
-        <w:text/>
-      </w:sdtPr>
-      <w:sdtContent>
-        <w:p>
-          <w:pPr>
-            <w:tabs>
-              <w:tab w:val="right" w:pos="10800"/>
-            </w:tabs>
-            <w:spacing w:before="200" w:after="0" w:line="240" w:lineRule="auto"/>
-            <w:rPr>
-              <w:rFonts w:ascii="Roboto Light" w:eastAsia="Roboto Light" w:hAnsi="Roboto Light" w:cs="Roboto Light"/>
-              <w:i/>
-              <w:iCs/>
-              <w:sz w:val="20"/>
-              <w:szCs w:val="20"/>
-            </w:rPr>
-          </w:pPr>
-          <w:r>
-            <w:rPr>
-              <w:rFonts w:ascii="Roboto Light" w:eastAsia="Roboto Light" w:hAnsi="Roboto Light" w:cs="Roboto Light"/>
-              <w:i/>
-              <w:iCs/>
-              <w:sz w:val="20"/>
-              <w:szCs w:val="20"/>
-            </w:rPr>
-            <w:t>Artificial Compute</w:t>
-            <w:tab/>
-            <w:t>Remote</w:t>
-          </w:r>
-        </w:p>
-      </w:sdtContent>
-    </w:sdt>
-    <w:sdt>
-      <w:sdtPr>
-        <w:alias w:val="experience.3.title_line"/>
-        <w:tag w:val="experience.3.title_line"/>
-        <w:id w:val="-593006694"/>
-        <w:text/>
-      </w:sdtPr>
-      <w:sdtContent>
-        <w:p>
-          <w:pPr>
-            <w:tabs>
-              <w:tab w:val="right" w:pos="10800"/>
-            </w:tabs>
-            <w:spacing w:after="120" w:line="240" w:lineRule="auto"/>
-            <w:rPr>
-              <w:rFonts w:ascii="Roboto Light" w:eastAsia="Roboto Light" w:hAnsi="Roboto Light" w:cs="Roboto Light"/>
-              <w:i/>
-              <w:iCs/>
-              <w:sz w:val="20"/>
-              <w:szCs w:val="20"/>
-            </w:rPr>
-          </w:pPr>
-          <w:r>
-            <w:rPr>
-              <w:rFonts w:ascii="Roboto Light" w:eastAsia="Roboto Light" w:hAnsi="Roboto Light" w:cs="Roboto Light"/>
-              <w:i/>
-              <w:iCs/>
-              <w:sz w:val="20"/>
-              <w:szCs w:val="20"/>
-              <w:b/>
-            </w:rPr>
-            <w:t>Front-end Developer</w:t>
-          </w:r>
-          <w:r>
-            <w:tab/>
-          </w:r>
-          <w:r>
-            <w:rPr>
-              <w:rFonts w:ascii="Roboto Light" w:eastAsia="Roboto Light" w:hAnsi="Roboto Light" w:cs="Roboto Light"/>
-              <w:i/>
-              <w:iCs/>
-              <w:sz w:val="20"/>
-              <w:szCs w:val="20"/>
-            </w:rPr>
-            <w:t>June 2023 - July 2024</w:t>
-          </w:r>
-        </w:p>
-      </w:sdtContent>
-    </w:sdt>
-    <w:sdt>
-      <w:sdtPr>
+        <w:tag w:val="experience.3.bullets.0"/>
         <w:alias w:val="experience.3.bullets.0"/>
-        <w:tag w:val="experience.3.bullets.0"/>
-        <w:id w:val="-1343537178"/>
         <w:text/>
       </w:sdtPr>
       <w:sdtContent>
@@ -796,13 +812,13 @@
             <w:pStyle w:val="ListParagraph"/>
             <w:numPr>
               <w:ilvl w:val="0"/>
-              <w:numId w:val="21"/>
+              <w:numId w:val="24"/>
             </w:numPr>
             <w:tabs>
               <w:tab w:val="right" w:pos="10800"/>
             </w:tabs>
-            <w:spacing w:after="0" w:line="240" w:lineRule="auto"/>
-            <w:ind w:left="187" w:hanging="187"/>
+            <w:spacing w:before="200" w:after="0" w:line="240" w:lineRule="auto"/>
+            <w:ind w:left="180" w:hanging="180"/>
             <w:rPr>
               <w:rFonts w:ascii="Roboto Light" w:eastAsia="Roboto Light" w:hAnsi="Roboto Light" w:cs="Roboto Light"/>
               <w:sz w:val="20"/>
@@ -815,247 +831,14 @@
               <w:sz w:val="20"/>
               <w:szCs w:val="20"/>
             </w:rPr>
-            <w:t>Developed Next.js/React/Redux features that increased user engagement by 30%.</w:t>
-          </w:r>
-        </w:p>
-      </w:sdtContent>
-    </w:sdt>
-    <w:sdt>
-      <w:sdtPr>
-        <w:alias w:val="experience.4.company_line"/>
-        <w:tag w:val="experience.4.company_line"/>
-        <w:id w:val="-1167398809"/>
-        <w:text/>
-      </w:sdtPr>
-      <w:sdtContent>
-        <w:p>
-          <w:pPr>
-            <w:tabs>
-              <w:tab w:val="right" w:pos="10800"/>
-            </w:tabs>
-            <w:spacing w:before="120" w:after="0" w:line="240" w:lineRule="auto"/>
-            <w:rPr>
-              <w:rFonts w:ascii="Roboto Light" w:eastAsia="Roboto Light" w:hAnsi="Roboto Light" w:cs="Roboto Light"/>
-              <w:sz w:val="20"/>
-              <w:szCs w:val="20"/>
-            </w:rPr>
-          </w:pPr>
-          <w:r>
-            <w:rPr>
-              <w:rFonts w:ascii="Roboto Light" w:eastAsia="Roboto Light" w:hAnsi="Roboto Light" w:cs="Roboto Light"/>
-              <w:sz w:val="20"/>
-              <w:szCs w:val="20"/>
-            </w:rPr>
-            <w:t>Rodeo Logistics, LLC</w:t>
-            <w:tab/>
-            <w:t>Austin, TX - Remote</w:t>
-          </w:r>
-        </w:p>
-      </w:sdtContent>
-    </w:sdt>
-    <w:sdt>
-      <w:sdtPr>
-        <w:alias w:val="experience.4.title_line"/>
-        <w:tag w:val="experience.4.title_line"/>
-        <w:id w:val="369344386"/>
-        <w:text/>
-      </w:sdtPr>
-      <w:sdtContent>
-        <w:p>
-          <w:pPr>
-            <w:tabs>
-              <w:tab w:val="right" w:pos="10800"/>
-            </w:tabs>
-            <w:spacing w:after="120" w:line="240" w:lineRule="auto"/>
-            <w:rPr>
-              <w:rFonts w:ascii="Roboto Light" w:eastAsia="Roboto Light" w:hAnsi="Roboto Light" w:cs="Roboto Light"/>
-              <w:i/>
-              <w:iCs/>
-              <w:sz w:val="20"/>
-              <w:szCs w:val="20"/>
-            </w:rPr>
-          </w:pPr>
-          <w:r>
-            <w:rPr>
-              <w:rFonts w:ascii="Roboto Light" w:eastAsia="Roboto Light" w:hAnsi="Roboto Light" w:cs="Roboto Light"/>
-              <w:i/>
-              <w:iCs/>
-              <w:sz w:val="20"/>
-              <w:szCs w:val="20"/>
-              <w:b/>
-            </w:rPr>
-            <w:t>Full-Stack Developer</w:t>
-          </w:r>
-          <w:r>
-            <w:tab/>
-          </w:r>
-          <w:r>
-            <w:rPr>
-              <w:rFonts w:ascii="Roboto Light" w:eastAsia="Roboto Light" w:hAnsi="Roboto Light" w:cs="Roboto Light"/>
-              <w:i/>
-              <w:iCs/>
-              <w:sz w:val="20"/>
-              <w:szCs w:val="20"/>
-            </w:rPr>
-            <w:t>December 2021 - February 2023</w:t>
-          </w:r>
-        </w:p>
-      </w:sdtContent>
-    </w:sdt>
-    <w:sdt>
-      <w:sdtPr>
-        <w:alias w:val="experience.4.bullets.0"/>
-        <w:tag w:val="experience.4.bullets.0"/>
-        <w:id w:val="1283762307"/>
-        <w:text/>
-      </w:sdtPr>
-      <w:sdtContent>
-        <w:p>
-          <w:pPr>
-            <w:pStyle w:val="ListParagraph"/>
-            <w:numPr>
-              <w:ilvl w:val="0"/>
-              <w:numId w:val="18"/>
-            </w:numPr>
-            <w:tabs>
-              <w:tab w:val="right" w:pos="10800"/>
-            </w:tabs>
-            <w:spacing w:after="0" w:line="240" w:lineRule="auto"/>
-            <w:rPr>
-              <w:rFonts w:ascii="Roboto Light" w:eastAsia="Roboto Light" w:hAnsi="Roboto Light" w:cs="Roboto Light"/>
-              <w:sz w:val="20"/>
-              <w:szCs w:val="20"/>
-            </w:rPr>
-          </w:pPr>
-          <w:r>
-            <w:rPr>
-              <w:rFonts w:ascii="Roboto Light" w:eastAsia="Roboto Light" w:hAnsi="Roboto Light" w:cs="Roboto Light"/>
-              <w:sz w:val="20"/>
-              <w:szCs w:val="20"/>
-            </w:rPr>
-            <w:t>Built React, TypeScript, GraphQL, and Node.js business tools to modernize logistics operations.</w:t>
-          </w:r>
-        </w:p>
-      </w:sdtContent>
-    </w:sdt>
-    <w:sdt>
-      <w:sdtPr>
-        <w:alias w:val="experience.5.company_line"/>
-        <w:tag w:val="experience.5.company_line"/>
-        <w:id w:val="171391169"/>
-        <w:text/>
-      </w:sdtPr>
-      <w:sdtContent>
-        <w:p>
-          <w:pPr>
-            <w:tabs>
-              <w:tab w:val="right" w:pos="10800"/>
-            </w:tabs>
-            <w:spacing w:before="200" w:after="0" w:line="240" w:lineRule="auto"/>
-            <w:rPr>
-              <w:rFonts w:ascii="Roboto Light" w:eastAsia="Roboto Light" w:hAnsi="Roboto Light" w:cs="Roboto Light"/>
-              <w:sz w:val="20"/>
-              <w:szCs w:val="20"/>
-            </w:rPr>
-          </w:pPr>
-          <w:r>
-            <w:rPr>
-              <w:rFonts w:ascii="Roboto Light" w:eastAsia="Roboto Light" w:hAnsi="Roboto Light" w:cs="Roboto Light"/>
-              <w:sz w:val="20"/>
-              <w:szCs w:val="20"/>
-            </w:rPr>
-            <w:t>DevWorks</w:t>
-            <w:tab/>
-            <w:t>Austin, TX</w:t>
-          </w:r>
-        </w:p>
-      </w:sdtContent>
-    </w:sdt>
-    <w:sdt>
-      <w:sdtPr>
-        <w:alias w:val="experience.5.title_line"/>
-        <w:tag w:val="experience.5.title_line"/>
-        <w:id w:val="-2096006264"/>
-        <w:text/>
-      </w:sdtPr>
-      <w:sdtContent>
-        <w:p>
-          <w:pPr>
-            <w:tabs>
-              <w:tab w:val="right" w:pos="10800"/>
-            </w:tabs>
-            <w:spacing w:after="120" w:line="240" w:lineRule="auto"/>
-            <w:rPr>
-              <w:rFonts w:ascii="Roboto Light" w:eastAsia="Roboto Light" w:hAnsi="Roboto Light" w:cs="Roboto Light"/>
-              <w:i/>
-              <w:iCs/>
-              <w:sz w:val="20"/>
-              <w:szCs w:val="20"/>
-            </w:rPr>
-          </w:pPr>
-          <w:r>
-            <w:rPr>
-              <w:rFonts w:ascii="Roboto Light" w:eastAsia="Roboto Light" w:hAnsi="Roboto Light" w:cs="Roboto Light"/>
-              <w:i/>
-              <w:iCs/>
-              <w:sz w:val="20"/>
-              <w:szCs w:val="20"/>
-              <w:b/>
-            </w:rPr>
-            <w:t>Full-Stack Developer / Project Lead</w:t>
-          </w:r>
-          <w:r>
-            <w:tab/>
-          </w:r>
-          <w:r>
-            <w:rPr>
-              <w:rFonts w:ascii="Roboto Light" w:eastAsia="Roboto Light" w:hAnsi="Roboto Light" w:cs="Roboto Light"/>
-              <w:i/>
-              <w:iCs/>
-              <w:sz w:val="20"/>
-              <w:szCs w:val="20"/>
-            </w:rPr>
-            <w:t>March 2021 - December 2021</w:t>
-          </w:r>
-        </w:p>
-      </w:sdtContent>
-    </w:sdt>
-    <w:sdt>
-      <w:sdtPr>
-        <w:alias w:val="experience.5.bullets.0"/>
-        <w:tag w:val="experience.5.bullets.0"/>
-        <w:id w:val="1716545824"/>
-        <w:text/>
-      </w:sdtPr>
-      <w:sdtContent>
-        <w:p>
-          <w:pPr>
-            <w:pStyle w:val="ListParagraph"/>
-            <w:numPr>
-              <w:ilvl w:val="0"/>
-              <w:numId w:val="19"/>
-            </w:numPr>
-            <w:spacing w:after="120" w:line="240" w:lineRule="auto"/>
-            <w:rPr>
-              <w:rFonts w:ascii="Roboto Light" w:eastAsia="Roboto Light" w:hAnsi="Roboto Light" w:cs="Roboto Light"/>
-              <w:sz w:val="20"/>
-              <w:szCs w:val="20"/>
-            </w:rPr>
-          </w:pPr>
-          <w:r>
-            <w:rPr>
-              <w:rFonts w:ascii="Roboto Light" w:eastAsia="Roboto Light" w:hAnsi="Roboto Light" w:cs="Roboto Light"/>
-              <w:sz w:val="20"/>
-              <w:szCs w:val="20"/>
-            </w:rPr>
-            <w:t>Coordinated software projects and development teams, achieving a 95% on-time delivery rate.</w:t>
+            <w:t>Built React, Next.js, TypeScript, Node.js, GraphQL, and Redux applications across SaaS and logistics products, while also leading development projects and small engineering teams.</w:t>
           </w:r>
         </w:p>
       </w:sdtContent>
     </w:sdt>
     <w:p>
       <w:pPr>
-        <w:spacing w:after="100" w:line="240" w:lineRule="auto"/>
+        <w:spacing w:before="120" w:after="100" w:line="240" w:lineRule="auto"/>
         <w:rPr>
           <w:rFonts w:ascii="Roboto Light" w:eastAsia="Roboto Light" w:hAnsi="Roboto Light" w:cs="Roboto Light"/>
           <w:sz w:val="20"/>
@@ -1070,13 +853,13 @@
         <mc:AlternateContent>
           <mc:Choice Requires="wps">
             <w:drawing>
-              <wp:anchor distT="0" distB="0" distL="114300" distR="114300" simplePos="0" relativeHeight="251662336" behindDoc="0" locked="0" layoutInCell="1" hidden="0" allowOverlap="1" wp14:anchorId="6BCBBF1F" wp14:editId="7167318E">
+              <wp:anchor distT="0" distB="0" distL="114300" distR="114300" simplePos="0" relativeHeight="251662336" behindDoc="0" locked="0" layoutInCell="1" hidden="0" allowOverlap="1" wp14:anchorId="6BCBBF1F" wp14:editId="0BFB1BF3">
                 <wp:simplePos x="0" y="0"/>
-                <wp:positionH relativeFrom="column">
-                  <wp:posOffset>0</wp:posOffset>
+                <wp:positionH relativeFrom="margin">
+                  <wp:align>left</wp:align>
                 </wp:positionH>
                 <wp:positionV relativeFrom="paragraph">
-                  <wp:posOffset>172984</wp:posOffset>
+                  <wp:posOffset>258984</wp:posOffset>
                 </wp:positionV>
                 <wp:extent cx="6870700" cy="19050"/>
                 <wp:effectExtent l="0" t="0" r="25400" b="19050"/>
@@ -1115,8 +898,13 @@
           </mc:Choice>
           <mc:Fallback>
             <w:pict>
-              <v:shape w14:anchorId="737E944F" id="Straight Arrow Connector 602790726" o:spid="_x0000_s1026" type="#_x0000_t32" style="position:absolute;margin-left:0;margin-top:13.6pt;width:541pt;height:1.5pt;z-index:251662336;visibility:visible;mso-wrap-style:square;mso-wrap-distance-left:9pt;mso-wrap-distance-top:0;mso-wrap-distance-right:9pt;mso-wrap-distance-bottom:0;mso-position-horizontal:absolute;mso-position-horizontal-relative:text;mso-position-vertical:absolute;mso-position-vertical-relative:text" o:gfxdata="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" strokeweight="1.5pt">
+              <v:shapetype w14:anchorId="6CF788EB" id="_x0000_t32" coordsize="21600,21600" o:spt="32" o:oned="t" path="m,l21600,21600e" filled="f">
+                <v:path arrowok="t" fillok="f" o:connecttype="none"/>
+                <o:lock v:ext="edit" shapetype="t"/>
+              </v:shapetype>
+              <v:shape id="Straight Arrow Connector 602790726" o:spid="_x0000_s1026" type="#_x0000_t32" style="position:absolute;margin-left:0;margin-top:20.4pt;width:541pt;height:1.5pt;z-index:251662336;visibility:visible;mso-wrap-style:square;mso-wrap-distance-left:9pt;mso-wrap-distance-top:0;mso-wrap-distance-right:9pt;mso-wrap-distance-bottom:0;mso-position-horizontal:left;mso-position-horizontal-relative:margin;mso-position-vertical:absolute;mso-position-vertical-relative:text" o:gfxdata="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" strokeweight="1.5pt">
                 <v:stroke startarrowwidth="narrow" startarrowlength="short" endarrowwidth="narrow" endarrowlength="short" joinstyle="miter"/>
+                <w10:wrap anchorx="margin"/>
               </v:shape>
             </w:pict>
           </mc:Fallback>
@@ -1144,6 +932,7 @@
           <w:szCs w:val="20"/>
         </w:rPr>
       </w:pPr>
+      <w:proofErr w:type="spellStart"/>
       <w:r>
         <w:rPr>
           <w:rFonts w:ascii="Roboto Light" w:eastAsia="Roboto Light" w:hAnsi="Roboto Light" w:cs="Roboto Light"/>
@@ -1152,7 +941,18 @@
           <w:sz w:val="20"/>
           <w:szCs w:val="20"/>
         </w:rPr>
-        <w:t>Thinkful - Software Engineering Immersion</w:t>
+        <w:t>Thinkful</w:t>
+      </w:r>
+      <w:proofErr w:type="spellEnd"/>
+      <w:r>
+        <w:rPr>
+          <w:rFonts w:ascii="Roboto Light" w:eastAsia="Roboto Light" w:hAnsi="Roboto Light" w:cs="Roboto Light"/>
+          <w:b/>
+          <w:bCs/>
+          <w:sz w:val="20"/>
+          <w:szCs w:val="20"/>
+        </w:rPr>
+        <w:t xml:space="preserve"> - Software Engineering Immersion</w:t>
       </w:r>
       <w:r>
         <w:rPr>
@@ -1340,7 +1140,7 @@
               </wp:anchor>
             </w:drawing>
           </mc:Choice>
-          <mc:Fallback xmlns:cr="http://schemas.microsoft.com/office/comments/2020/reactions" xmlns="http://schemas.microsoft.com/office/tasks/2019/documenttasks" xmlns:dgm="http://schemas.openxmlformats.org/drawingml/2006/diagram" xmlns:lc="http://schemas.openxmlformats.org/drawingml/2006/lockedCanvas" xmlns:c="http://schemas.openxmlformats.org/drawingml/2006/chart" xmlns:pic="http://schemas.openxmlformats.org/drawingml/2006/picture" xmlns:a="http://schemas.openxmlformats.org/drawingml/2006/main" xmlns:sl="http://schemas.openxmlformats.org/schemaLibrary/2006/main">
+          <mc:Fallback xmlns:cr="http://schemas.microsoft.com/office/comments/2020/reactions" xmlns="http://schemas.microsoft.com/office/tasks/2019/documenttasks" xmlns:dgm="http://schemas.openxmlformats.org/drawingml/2006/diagram" xmlns:lc="http://schemas.openxmlformats.org/drawingml/2006/lockedCanvas" xmlns:c="http://schemas.openxmlformats.org/drawingml/2006/chart" xmlns:pic="http://schemas.openxmlformats.org/drawingml/2006/picture" xmlns:a="http://schemas.openxmlformats.org/drawingml/2006/main" xmlns:sl="http://schemas.openxmlformats.org/schemaLibrary/2006/main" xmlns:w16cei="http://schemas.microsoft.com/office/word/2026/wordml/cei">
             <w:drawing>
               <wp:anchor allowOverlap="1" behindDoc="0" distB="0" distT="0" distL="114300" distR="114300" hidden="0" layoutInCell="1" locked="0" relativeHeight="0" simplePos="0">
                 <wp:simplePos x="0" y="0"/>
@@ -1387,27 +1187,26 @@
     </w:p>
     <w:sdt>
       <w:sdtPr>
+        <w:tag w:val="skills.frontend"/>
         <w:alias w:val="skills.frontend"/>
-        <w:tag w:val="skills.frontend"/>
-        <w:id w:val="1373104328"/>
         <w:text/>
       </w:sdtPr>
       <w:sdtContent>
         <w:p>
           <w:pPr>
             <w:spacing w:before="100" w:after="0" w:line="240" w:lineRule="auto"/>
-            <w:ind w:left="90"/>
+            <w:ind w:left="90" w:hanging="90"/>
             <w:rPr>
               <w:rFonts w:ascii="Roboto Light" w:eastAsia="Roboto Light" w:hAnsi="Roboto Light" w:cs="Roboto Light"/>
-              <w:sz w:val="20"/>
-              <w:szCs w:val="20"/>
+              <w:sz w:val="21"/>
+              <w:szCs w:val="21"/>
             </w:rPr>
           </w:pPr>
           <w:r>
             <w:rPr>
               <w:rFonts w:ascii="Roboto Light" w:eastAsia="Roboto Light" w:hAnsi="Roboto Light" w:cs="Roboto Light"/>
-              <w:sz w:val="20"/>
-              <w:szCs w:val="20"/>
+              <w:sz w:val="21"/>
+              <w:szCs w:val="21"/>
               <w:b/>
             </w:rPr>
             <w:t>Frontend:</w:t>
@@ -1415,8 +1214,8 @@
           <w:r>
             <w:rPr>
               <w:rFonts w:ascii="Roboto Light" w:eastAsia="Roboto Light" w:hAnsi="Roboto Light" w:cs="Roboto Light"/>
-              <w:sz w:val="20"/>
-              <w:szCs w:val="20"/>
+              <w:sz w:val="21"/>
+              <w:szCs w:val="21"/>
             </w:rPr>
             <w:t xml:space="preserve"> React, Next.js, TypeScript, Redux, React Query, Tailwind, Figma</w:t>
           </w:r>
@@ -1425,27 +1224,26 @@
     </w:sdt>
     <w:sdt>
       <w:sdtPr>
+        <w:tag w:val="skills.architecture_backend"/>
         <w:alias w:val="skills.architecture_backend"/>
-        <w:tag w:val="skills.architecture_backend"/>
-        <w:id w:val="-1623836202"/>
         <w:text/>
       </w:sdtPr>
       <w:sdtContent>
         <w:p>
           <w:pPr>
             <w:spacing w:after="0" w:line="240" w:lineRule="auto"/>
-            <w:ind w:left="90"/>
+            <w:ind w:left="90" w:hanging="90"/>
             <w:rPr>
               <w:rFonts w:ascii="Roboto Light" w:eastAsia="Roboto Light" w:hAnsi="Roboto Light" w:cs="Roboto Light"/>
-              <w:sz w:val="20"/>
-              <w:szCs w:val="20"/>
+              <w:sz w:val="21"/>
+              <w:szCs w:val="21"/>
             </w:rPr>
           </w:pPr>
           <w:r>
             <w:rPr>
               <w:rFonts w:ascii="Roboto Light" w:eastAsia="Roboto Light" w:hAnsi="Roboto Light" w:cs="Roboto Light"/>
-              <w:sz w:val="20"/>
-              <w:szCs w:val="20"/>
+              <w:sz w:val="21"/>
+              <w:szCs w:val="21"/>
               <w:b/>
             </w:rPr>
             <w:t>Architecture &amp; Backend:</w:t>
@@ -1453,8 +1251,8 @@
           <w:r>
             <w:rPr>
               <w:rFonts w:ascii="Roboto Light" w:eastAsia="Roboto Light" w:hAnsi="Roboto Light" w:cs="Roboto Light"/>
-              <w:sz w:val="20"/>
-              <w:szCs w:val="20"/>
+              <w:sz w:val="21"/>
+              <w:szCs w:val="21"/>
             </w:rPr>
             <w:t xml:space="preserve"> System Design, API Design, Node.js, NestJS, Express, PostgreSQL, REST API, GraphQL</w:t>
           </w:r>
@@ -1463,27 +1261,26 @@
     </w:sdt>
     <w:sdt>
       <w:sdtPr>
+        <w:tag w:val="skills.ai_data"/>
         <w:alias w:val="skills.ai_data"/>
-        <w:tag w:val="skills.ai_data"/>
-        <w:id w:val="409353540"/>
         <w:text/>
       </w:sdtPr>
       <w:sdtContent>
         <w:p>
           <w:pPr>
             <w:spacing w:after="0" w:line="240" w:lineRule="auto"/>
-            <w:ind w:left="90"/>
+            <w:ind w:left="90" w:hanging="90"/>
             <w:rPr>
               <w:rFonts w:ascii="Roboto Light" w:eastAsia="Roboto Light" w:hAnsi="Roboto Light" w:cs="Roboto Light"/>
-              <w:sz w:val="20"/>
-              <w:szCs w:val="20"/>
+              <w:sz w:val="21"/>
+              <w:szCs w:val="21"/>
             </w:rPr>
           </w:pPr>
           <w:r>
             <w:rPr>
               <w:rFonts w:ascii="Roboto Light" w:eastAsia="Roboto Light" w:hAnsi="Roboto Light" w:cs="Roboto Light"/>
-              <w:sz w:val="20"/>
-              <w:szCs w:val="20"/>
+              <w:sz w:val="21"/>
+              <w:szCs w:val="21"/>
               <w:b/>
             </w:rPr>
             <w:t>AI &amp; Data:</w:t>
@@ -1491,8 +1288,8 @@
           <w:r>
             <w:rPr>
               <w:rFonts w:ascii="Roboto Light" w:eastAsia="Roboto Light" w:hAnsi="Roboto Light" w:cs="Roboto Light"/>
-              <w:sz w:val="20"/>
-              <w:szCs w:val="20"/>
+              <w:sz w:val="21"/>
+              <w:szCs w:val="21"/>
             </w:rPr>
             <w:t xml:space="preserve"> OpenAI, Claude, LangChain, LangGraph, RAG, LLM Orchestration, Multi-Agent Systems, Embeddings, Vector Search, ChromaDB, pgvector, DuckDB</w:t>
           </w:r>
@@ -1501,27 +1298,26 @@
     </w:sdt>
     <w:sdt>
       <w:sdtPr>
+        <w:tag w:val="skills.testing"/>
         <w:alias w:val="skills.testing"/>
-        <w:tag w:val="skills.testing"/>
-        <w:id w:val="-1219585367"/>
         <w:text/>
       </w:sdtPr>
       <w:sdtContent>
         <w:p>
           <w:pPr>
             <w:spacing w:after="0" w:line="240" w:lineRule="auto"/>
-            <w:ind w:left="90"/>
+            <w:ind w:left="90" w:hanging="90"/>
             <w:rPr>
               <w:rFonts w:ascii="Roboto Light" w:eastAsia="Roboto Light" w:hAnsi="Roboto Light" w:cs="Roboto Light"/>
-              <w:sz w:val="20"/>
-              <w:szCs w:val="20"/>
+              <w:sz w:val="21"/>
+              <w:szCs w:val="21"/>
             </w:rPr>
           </w:pPr>
           <w:r>
             <w:rPr>
               <w:rFonts w:ascii="Roboto Light" w:eastAsia="Roboto Light" w:hAnsi="Roboto Light" w:cs="Roboto Light"/>
-              <w:sz w:val="20"/>
-              <w:szCs w:val="20"/>
+              <w:sz w:val="21"/>
+              <w:szCs w:val="21"/>
               <w:b/>
             </w:rPr>
             <w:t>Testing:</w:t>
@@ -1529,8 +1325,8 @@
           <w:r>
             <w:rPr>
               <w:rFonts w:ascii="Roboto Light" w:eastAsia="Roboto Light" w:hAnsi="Roboto Light" w:cs="Roboto Light"/>
-              <w:sz w:val="20"/>
-              <w:szCs w:val="20"/>
+              <w:sz w:val="21"/>
+              <w:szCs w:val="21"/>
             </w:rPr>
             <w:t xml:space="preserve"> Playwright, Cypress, Vitest, Jest</w:t>
           </w:r>
@@ -1539,27 +1335,26 @@
     </w:sdt>
     <w:sdt>
       <w:sdtPr>
+        <w:tag w:val="skills.devops"/>
         <w:alias w:val="skills.devops"/>
-        <w:tag w:val="skills.devops"/>
-        <w:id w:val="-1491632151"/>
         <w:text/>
       </w:sdtPr>
       <w:sdtContent>
         <w:p>
           <w:pPr>
             <w:spacing w:after="0" w:line="240" w:lineRule="auto"/>
-            <w:ind w:left="90"/>
+            <w:ind w:left="90" w:hanging="90"/>
             <w:rPr>
               <w:rFonts w:ascii="Roboto Light" w:eastAsia="Roboto Light" w:hAnsi="Roboto Light" w:cs="Roboto Light"/>
-              <w:sz w:val="20"/>
-              <w:szCs w:val="20"/>
+              <w:sz w:val="21"/>
+              <w:szCs w:val="21"/>
             </w:rPr>
           </w:pPr>
           <w:r>
             <w:rPr>
               <w:rFonts w:ascii="Roboto Light" w:eastAsia="Roboto Light" w:hAnsi="Roboto Light" w:cs="Roboto Light"/>
-              <w:sz w:val="20"/>
-              <w:szCs w:val="20"/>
+              <w:sz w:val="21"/>
+              <w:szCs w:val="21"/>
               <w:b/>
             </w:rPr>
             <w:t>DevOps:</w:t>
@@ -1567,8 +1362,8 @@
           <w:r>
             <w:rPr>
               <w:rFonts w:ascii="Roboto Light" w:eastAsia="Roboto Light" w:hAnsi="Roboto Light" w:cs="Roboto Light"/>
-              <w:sz w:val="20"/>
-              <w:szCs w:val="20"/>
+              <w:sz w:val="21"/>
+              <w:szCs w:val="21"/>
             </w:rPr>
             <w:t xml:space="preserve"> AWS, Docker, CircleCI, Vercel, Fly.io</w:t>
           </w:r>
@@ -1577,22 +1372,21 @@
     </w:sdt>
     <w:sdt>
       <w:sdtPr>
+        <w:tag w:val="skills.tools"/>
         <w:alias w:val="skills.tools"/>
-        <w:tag w:val="skills.tools"/>
-        <w:id w:val="2016954135"/>
         <w:text/>
       </w:sdtPr>
       <w:sdtContent>
         <w:p>
           <w:pPr>
             <w:spacing w:after="0" w:line="240" w:lineRule="auto"/>
-            <w:ind w:left="90"/>
+            <w:ind w:left="90" w:hanging="90"/>
             <w:rPr>
               <w:rFonts w:ascii="Roboto Light" w:eastAsia="Roboto Light" w:hAnsi="Roboto Light" w:cs="Roboto Light"/>
               <w:b/>
               <w:bCs/>
-              <w:sz w:val="20"/>
-              <w:szCs w:val="20"/>
+              <w:sz w:val="21"/>
+              <w:szCs w:val="21"/>
             </w:rPr>
           </w:pPr>
           <w:r>
@@ -1600,8 +1394,8 @@
               <w:rFonts w:ascii="Roboto Light" w:eastAsia="Roboto Light" w:hAnsi="Roboto Light" w:cs="Roboto Light"/>
               <w:b/>
               <w:bCs/>
-              <w:sz w:val="20"/>
-              <w:szCs w:val="20"/>
+              <w:sz w:val="21"/>
+              <w:szCs w:val="21"/>
             </w:rPr>
             <w:t>Tools:</w:t>
           </w:r>
@@ -1609,8 +1403,8 @@
             <w:rPr>
               <w:rFonts w:ascii="Roboto Light" w:eastAsia="Roboto Light" w:hAnsi="Roboto Light" w:cs="Roboto Light"/>
               <w:bCs/>
-              <w:sz w:val="20"/>
-              <w:szCs w:val="20"/>
+              <w:sz w:val="21"/>
+              <w:szCs w:val="21"/>
             </w:rPr>
             <w:t xml:space="preserve"> Bash, Git, JIRA, Postman</w:t>
           </w:r>
@@ -1628,7 +1422,7 @@
 </file>
 
 <file path=word/numbering.xml><?xml version="1.0" encoding="utf-8"?>
-<w:numbering xmlns:wpc="http://schemas.microsoft.com/office/word/2010/wordprocessingCanvas" xmlns:cx="http://schemas.microsoft.com/office/drawing/2014/chartex" xmlns:cx1="http://schemas.microsoft.com/office/drawing/2015/9/8/chartex" xmlns:cx2="http://schemas.microsoft.com/office/drawing/2015/10/21/chartex" xmlns:cx3="http://schemas.microsoft.com/office/drawing/2016/5/9/chartex" xmlns:cx4="http://schemas.microsoft.com/office/drawing/2016/5/10/chartex" xmlns:cx5="http://schemas.microsoft.com/office/drawing/2016/5/11/chartex" xmlns:cx6="http://schemas.microsoft.com/office/drawing/2016/5/12/chartex" xmlns:cx7="http://schemas.microsoft.com/office/drawing/2016/5/13/chartex" xmlns:cx8="http://schemas.microsoft.com/office/drawing/2016/5/14/chartex" xmlns:mc="http://schemas.openxmlformats.org/markup-compatibility/2006" xmlns:aink="http://schemas.microsoft.com/office/drawing/2016/ink" xmlns:am3d="http://schemas.microsoft.com/office/drawing/2017/model3d" xmlns:o="urn:schemas-microsoft-com:office:office" xmlns:oel="http://schemas.microsoft.com/office/2019/extlst" xmlns:r="http://schemas.openxmlformats.org/officeDocument/2006/relationships" xmlns:m="http://schemas.openxmlformats.org/officeDocument/2006/math" xmlns:v="urn:schemas-microsoft-com:vml" xmlns:wp14="http://schemas.microsoft.com/office/word/2010/wordprocessingDrawing" xmlns:wp="http://schemas.openxmlformats.org/drawingml/2006/wordprocessingDrawing" xmlns:w10="urn:schemas-microsoft-com:office:word" xmlns:w="http://schemas.openxmlformats.org/wordprocessingml/2006/main" xmlns:w14="http://schemas.microsoft.com/office/word/2010/wordml" xmlns:w15="http://schemas.microsoft.com/office/word/2012/wordml" xmlns:w16cei="http://schemas.microsoft.com/office/word/2026/wordml/cei" xmlns:w16cex="http://schemas.microsoft.com/office/word/2018/wordml/cex" xmlns:w16cid="http://schemas.microsoft.com/office/word/2016/wordml/cid" xmlns:w16="http://schemas.microsoft.com/office/word/2018/wordml" xmlns:w16du="http://schemas.microsoft.com/office/word/2023/wordml/word16du" xmlns:w16sdtdh="http://schemas.microsoft.com/office/word/2020/wordml/sdtdatahash" xmlns:w16sdtfl="http://schemas.microsoft.com/office/word/2024/wordml/sdtformatlock" xmlns:w16se="http://schemas.microsoft.com/office/word/2015/wordml/symex" xmlns:wpg="http://schemas.microsoft.com/office/word/2010/wordprocessingGroup" xmlns:wpi="http://schemas.microsoft.com/office/word/2010/wordprocessingInk" xmlns:wne="http://schemas.microsoft.com/office/word/2006/wordml" xmlns:wps="http://schemas.microsoft.com/office/word/2010/wordprocessingShape" mc:Ignorable="w14 w15 w16se w16cid w16 w16cex w16sdtdh w16sdtfl w16du wp14">
+<w:numbering xmlns:wpc="http://schemas.microsoft.com/office/word/2010/wordprocessingCanvas" xmlns:cx="http://schemas.microsoft.com/office/drawing/2014/chartex" xmlns:cx1="http://schemas.microsoft.com/office/drawing/2015/9/8/chartex" xmlns:cx2="http://schemas.microsoft.com/office/drawing/2015/10/21/chartex" xmlns:cx3="http://schemas.microsoft.com/office/drawing/2016/5/9/chartex" xmlns:cx4="http://schemas.microsoft.com/office/drawing/2016/5/10/chartex" xmlns:cx5="http://schemas.microsoft.com/office/drawing/2016/5/11/chartex" xmlns:cx6="http://schemas.microsoft.com/office/drawing/2016/5/12/chartex" xmlns:cx7="http://schemas.microsoft.com/office/drawing/2016/5/13/chartex" xmlns:cx8="http://schemas.microsoft.com/office/drawing/2016/5/14/chartex" xmlns:mc="http://schemas.openxmlformats.org/markup-compatibility/2006" xmlns:aink="http://schemas.microsoft.com/office/drawing/2016/ink" xmlns:am3d="http://schemas.microsoft.com/office/drawing/2017/model3d" xmlns:o="urn:schemas-microsoft-com:office:office" xmlns:oel="http://schemas.microsoft.com/office/2019/extlst" xmlns:r="http://schemas.openxmlformats.org/officeDocument/2006/relationships" xmlns:m="http://schemas.openxmlformats.org/officeDocument/2006/math" xmlns:v="urn:schemas-microsoft-com:vml" xmlns:wp14="http://schemas.microsoft.com/office/word/2010/wordprocessingDrawing" xmlns:wp="http://schemas.openxmlformats.org/drawingml/2006/wordprocessingDrawing" xmlns:w10="urn:schemas-microsoft-com:office:word" xmlns:w="http://schemas.openxmlformats.org/wordprocessingml/2006/main" xmlns:w14="http://schemas.microsoft.com/office/word/2010/wordml" xmlns:w15="http://schemas.microsoft.com/office/word/2012/wordml" xmlns:w16cex="http://schemas.microsoft.com/office/word/2018/wordml/cex" xmlns:w16cid="http://schemas.microsoft.com/office/word/2016/wordml/cid" xmlns:w16="http://schemas.microsoft.com/office/word/2018/wordml" xmlns:w16du="http://schemas.microsoft.com/office/word/2023/wordml/word16du" xmlns:w16sdtdh="http://schemas.microsoft.com/office/word/2020/wordml/sdtdatahash" xmlns:w16sdtfl="http://schemas.microsoft.com/office/word/2024/wordml/sdtformatlock" xmlns:w16se="http://schemas.microsoft.com/office/word/2015/wordml/symex" xmlns:wpg="http://schemas.microsoft.com/office/word/2010/wordprocessingGroup" xmlns:wpi="http://schemas.microsoft.com/office/word/2010/wordprocessingInk" xmlns:wne="http://schemas.microsoft.com/office/word/2006/wordml" xmlns:wps="http://schemas.microsoft.com/office/word/2010/wordprocessingShape" mc:Ignorable="w14 w15 w16se w16cid w16 w16cex w16sdtdh w16sdtfl w16du wp14">
   <w:abstractNum w:abstractNumId="0" w15:restartNumberingAfterBreak="0">
     <w:nsid w:val="0E2140DF"/>
     <w:multiLevelType w:val="hybridMultilevel"/>
@@ -3892,6 +3686,155 @@
     </w:lvl>
   </w:abstractNum>
   <w:abstractNum w:abstractNumId="20" w15:restartNumberingAfterBreak="0">
+    <w:nsid w:val="5C42128D"/>
+    <w:multiLevelType w:val="multilevel"/>
+    <w:tmpl w:val="D788F9E0"/>
+    <w:lvl w:ilvl="0">
+      <w:start w:val="1"/>
+      <w:numFmt w:val="bullet"/>
+      <w:lvlText w:val=""/>
+      <w:lvlJc w:val="left"/>
+      <w:pPr>
+        <w:tabs>
+          <w:tab w:val="num" w:pos="720"/>
+        </w:tabs>
+        <w:ind w:left="720" w:hanging="360"/>
+      </w:pPr>
+      <w:rPr>
+        <w:rFonts w:ascii="Symbol" w:hAnsi="Symbol" w:hint="default"/>
+        <w:sz w:val="20"/>
+      </w:rPr>
+    </w:lvl>
+    <w:lvl w:ilvl="1" w:tentative="1">
+      <w:start w:val="1"/>
+      <w:numFmt w:val="bullet"/>
+      <w:lvlText w:val="o"/>
+      <w:lvlJc w:val="left"/>
+      <w:pPr>
+        <w:tabs>
+          <w:tab w:val="num" w:pos="1440"/>
+        </w:tabs>
+        <w:ind w:left="1440" w:hanging="360"/>
+      </w:pPr>
+      <w:rPr>
+        <w:rFonts w:ascii="Courier New" w:hAnsi="Courier New" w:hint="default"/>
+        <w:sz w:val="20"/>
+      </w:rPr>
+    </w:lvl>
+    <w:lvl w:ilvl="2" w:tentative="1">
+      <w:start w:val="1"/>
+      <w:numFmt w:val="bullet"/>
+      <w:lvlText w:val=""/>
+      <w:lvlJc w:val="left"/>
+      <w:pPr>
+        <w:tabs>
+          <w:tab w:val="num" w:pos="2160"/>
+        </w:tabs>
+        <w:ind w:left="2160" w:hanging="360"/>
+      </w:pPr>
+      <w:rPr>
+        <w:rFonts w:ascii="Wingdings" w:hAnsi="Wingdings" w:hint="default"/>
+        <w:sz w:val="20"/>
+      </w:rPr>
+    </w:lvl>
+    <w:lvl w:ilvl="3" w:tentative="1">
+      <w:start w:val="1"/>
+      <w:numFmt w:val="bullet"/>
+      <w:lvlText w:val=""/>
+      <w:lvlJc w:val="left"/>
+      <w:pPr>
+        <w:tabs>
+          <w:tab w:val="num" w:pos="2880"/>
+        </w:tabs>
+        <w:ind w:left="2880" w:hanging="360"/>
+      </w:pPr>
+      <w:rPr>
+        <w:rFonts w:ascii="Wingdings" w:hAnsi="Wingdings" w:hint="default"/>
+        <w:sz w:val="20"/>
+      </w:rPr>
+    </w:lvl>
+    <w:lvl w:ilvl="4" w:tentative="1">
+      <w:start w:val="1"/>
+      <w:numFmt w:val="bullet"/>
+      <w:lvlText w:val=""/>
+      <w:lvlJc w:val="left"/>
+      <w:pPr>
+        <w:tabs>
+          <w:tab w:val="num" w:pos="3600"/>
+        </w:tabs>
+        <w:ind w:left="3600" w:hanging="360"/>
+      </w:pPr>
+      <w:rPr>
+        <w:rFonts w:ascii="Wingdings" w:hAnsi="Wingdings" w:hint="default"/>
+        <w:sz w:val="20"/>
+      </w:rPr>
+    </w:lvl>
+    <w:lvl w:ilvl="5" w:tentative="1">
+      <w:start w:val="1"/>
+      <w:numFmt w:val="bullet"/>
+      <w:lvlText w:val=""/>
+      <w:lvlJc w:val="left"/>
+      <w:pPr>
+        <w:tabs>
+          <w:tab w:val="num" w:pos="4320"/>
+        </w:tabs>
+        <w:ind w:left="4320" w:hanging="360"/>
+      </w:pPr>
+      <w:rPr>
+        <w:rFonts w:ascii="Wingdings" w:hAnsi="Wingdings" w:hint="default"/>
+        <w:sz w:val="20"/>
+      </w:rPr>
+    </w:lvl>
+    <w:lvl w:ilvl="6" w:tentative="1">
+      <w:start w:val="1"/>
+      <w:numFmt w:val="bullet"/>
+      <w:lvlText w:val=""/>
+      <w:lvlJc w:val="left"/>
+      <w:pPr>
+        <w:tabs>
+          <w:tab w:val="num" w:pos="5040"/>
+        </w:tabs>
+        <w:ind w:left="5040" w:hanging="360"/>
+      </w:pPr>
+      <w:rPr>
+        <w:rFonts w:ascii="Wingdings" w:hAnsi="Wingdings" w:hint="default"/>
+        <w:sz w:val="20"/>
+      </w:rPr>
+    </w:lvl>
+    <w:lvl w:ilvl="7" w:tentative="1">
+      <w:start w:val="1"/>
+      <w:numFmt w:val="bullet"/>
+      <w:lvlText w:val=""/>
+      <w:lvlJc w:val="left"/>
+      <w:pPr>
+        <w:tabs>
+          <w:tab w:val="num" w:pos="5760"/>
+        </w:tabs>
+        <w:ind w:left="5760" w:hanging="360"/>
+      </w:pPr>
+      <w:rPr>
+        <w:rFonts w:ascii="Wingdings" w:hAnsi="Wingdings" w:hint="default"/>
+        <w:sz w:val="20"/>
+      </w:rPr>
+    </w:lvl>
+    <w:lvl w:ilvl="8" w:tentative="1">
+      <w:start w:val="1"/>
+      <w:numFmt w:val="bullet"/>
+      <w:lvlText w:val=""/>
+      <w:lvlJc w:val="left"/>
+      <w:pPr>
+        <w:tabs>
+          <w:tab w:val="num" w:pos="6480"/>
+        </w:tabs>
+        <w:ind w:left="6480" w:hanging="360"/>
+      </w:pPr>
+      <w:rPr>
+        <w:rFonts w:ascii="Wingdings" w:hAnsi="Wingdings" w:hint="default"/>
+        <w:sz w:val="20"/>
+      </w:rPr>
+    </w:lvl>
+  </w:abstractNum>
+  <w:abstractNum w:abstractNumId="21" w15:restartNumberingAfterBreak="0">
     <w:nsid w:val="66A64354"/>
     <w:multiLevelType w:val="hybridMultilevel"/>
     <w:tmpl w:val="17E074B4"/>
@@ -4004,7 +3947,7 @@
       </w:rPr>
     </w:lvl>
   </w:abstractNum>
-  <w:abstractNum w:abstractNumId="21" w15:restartNumberingAfterBreak="0">
+  <w:abstractNum w:abstractNumId="22" w15:restartNumberingAfterBreak="0">
     <w:nsid w:val="6A4F29AD"/>
     <w:multiLevelType w:val="hybridMultilevel"/>
     <w:tmpl w:val="F0B01D7E"/>
@@ -4117,7 +4060,7 @@
       </w:rPr>
     </w:lvl>
   </w:abstractNum>
-  <w:abstractNum w:abstractNumId="22" w15:restartNumberingAfterBreak="0">
+  <w:abstractNum w:abstractNumId="23" w15:restartNumberingAfterBreak="0">
     <w:nsid w:val="6FD5176B"/>
     <w:multiLevelType w:val="hybridMultilevel"/>
     <w:tmpl w:val="2DF68644"/>
@@ -4230,7 +4173,7 @@
       </w:rPr>
     </w:lvl>
   </w:abstractNum>
-  <w:abstractNum w:abstractNumId="23" w15:restartNumberingAfterBreak="0">
+  <w:abstractNum w:abstractNumId="24" w15:restartNumberingAfterBreak="0">
     <w:nsid w:val="6FD75ABB"/>
     <w:multiLevelType w:val="multilevel"/>
     <w:tmpl w:val="8C7E3680"/>
@@ -4345,7 +4288,7 @@
       </w:rPr>
     </w:lvl>
   </w:abstractNum>
-  <w:abstractNum w:abstractNumId="24" w15:restartNumberingAfterBreak="0">
+  <w:abstractNum w:abstractNumId="25" w15:restartNumberingAfterBreak="0">
     <w:nsid w:val="7C7B53B9"/>
     <w:multiLevelType w:val="multilevel"/>
     <w:tmpl w:val="3BE641AE"/>
@@ -4461,13 +4404,13 @@
     </w:lvl>
   </w:abstractNum>
   <w:num w:numId="1" w16cid:durableId="1233390664">
-    <w:abstractNumId w:val="23"/>
+    <w:abstractNumId w:val="24"/>
   </w:num>
   <w:num w:numId="2" w16cid:durableId="398216363">
     <w:abstractNumId w:val="2"/>
   </w:num>
   <w:num w:numId="3" w16cid:durableId="1971011880">
-    <w:abstractNumId w:val="24"/>
+    <w:abstractNumId w:val="25"/>
   </w:num>
   <w:num w:numId="4" w16cid:durableId="1804107515">
     <w:abstractNumId w:val="7"/>
@@ -4494,7 +4437,7 @@
     <w:abstractNumId w:val="4"/>
   </w:num>
   <w:num w:numId="12" w16cid:durableId="486674619">
-    <w:abstractNumId w:val="21"/>
+    <w:abstractNumId w:val="22"/>
   </w:num>
   <w:num w:numId="13" w16cid:durableId="1696272801">
     <w:abstractNumId w:val="3"/>
@@ -4512,7 +4455,7 @@
     <w:abstractNumId w:val="12"/>
   </w:num>
   <w:num w:numId="18" w16cid:durableId="756639443">
-    <w:abstractNumId w:val="20"/>
+    <w:abstractNumId w:val="21"/>
   </w:num>
   <w:num w:numId="19" w16cid:durableId="153768536">
     <w:abstractNumId w:val="9"/>
@@ -4521,7 +4464,7 @@
     <w:abstractNumId w:val="16"/>
   </w:num>
   <w:num w:numId="21" w16cid:durableId="435447563">
-    <w:abstractNumId w:val="22"/>
+    <w:abstractNumId w:val="23"/>
   </w:num>
   <w:num w:numId="22" w16cid:durableId="238633783">
     <w:abstractNumId w:val="19"/>
@@ -4534,6 +4477,9 @@
   </w:num>
   <w:num w:numId="25" w16cid:durableId="263534113">
     <w:abstractNumId w:val="11"/>
+  </w:num>
+  <w:num w:numId="26" w16cid:durableId="1571886865">
+    <w:abstractNumId w:val="20"/>
   </w:num>
 </w:numbering>
 </file>

</xml_diff>